<commit_message>
Euspa and European Council
</commit_message>
<xml_diff>
--- a/01_POLICY/EU/Commission/Legislative proposals/Index _01Policy_EU_commission_Legislative proposals.docx
+++ b/01_POLICY/EU/Commission/Legislative proposals/Index _01Policy_EU_commission_Legislative proposals.docx
@@ -78,6 +78,58 @@
     </w:p>
     <w:p>
       <w:r>
+        <w:t xml:space="preserve">Brussels, 16.7.2025 </w:t>
+      </w:r>
+      <w:proofErr w:type="gramStart"/>
+      <w:r>
+        <w:t>COM(</w:t>
+      </w:r>
+      <w:proofErr w:type="gramEnd"/>
+      <w:r>
+        <w:t>2025) 555 final 2025/0555 (COD) Proposal for a REGULATION OF THE EUROPEAN PARLIAMENT AND OF THE COUNCIL on establishing the European Competitiveness Fund ('ECF’), including the specific programme for defence research and innovation activities, repealing Regulations (EU) 2021/522, (EU) 2021/694, (EU) 2021/697, (EU) 2021/783, repealing provisions of Regulations (EU) 2021/696, (EU) 2023/588, and amending Regulation (EU) [EDIP]</w:t>
+      </w:r>
+    </w:p>
+    <w:p>
+      <w:r>
+        <w:t xml:space="preserve">Brussels, 16.7.2025 </w:t>
+      </w:r>
+      <w:proofErr w:type="gramStart"/>
+      <w:r>
+        <w:t>COM(</w:t>
+      </w:r>
+      <w:proofErr w:type="gramEnd"/>
+      <w:r>
+        <w:t>2025) 571 final 2025/571 (APP) Proposal for a COUNCIL REGULATION laying down the multiannual financial framework for the years 2028 to 2034</w:t>
+      </w:r>
+    </w:p>
+    <w:p>
+      <w:r>
+        <w:t xml:space="preserve">Brussels, 16.7.2025 </w:t>
+      </w:r>
+      <w:proofErr w:type="gramStart"/>
+      <w:r>
+        <w:t>COM(</w:t>
+      </w:r>
+      <w:proofErr w:type="gramEnd"/>
+      <w:r>
+        <w:t>2025) 571 final ANNEX to the proposal for a COUNCIL REGULATION laying down the multiannual financial framework for the years 2028 to 2034</w:t>
+      </w:r>
+    </w:p>
+    <w:p>
+      <w:r>
+        <w:t xml:space="preserve">Brussels, 16.7.2025 </w:t>
+      </w:r>
+      <w:proofErr w:type="gramStart"/>
+      <w:r>
+        <w:t>COM(</w:t>
+      </w:r>
+      <w:proofErr w:type="gramEnd"/>
+      <w:r>
+        <w:t>2025) 543 final 2025/0543 (COD) Proposal for a REGULATION OF THE EUROPEAN PARLIAMENT AND OF THE COUNCIL establishing Horizon Europe, the Framework Programme for Research and Innovation, for the period 2028-2034 laying down its rules for participation and dissemination, and repealing Regulation (EU) 2021/695</w:t>
+      </w:r>
+    </w:p>
+    <w:p>
+      <w:r>
         <w:t xml:space="preserve">Brussels, 7.4.2026 </w:t>
       </w:r>
       <w:proofErr w:type="gramStart"/>
@@ -89,7 +141,6 @@
         <w:t>2026) 152 final 2026/0084 (COD) Proposal for a REGULATION OF THE EUROPEAN PARLIAMENT AND OF THE COUNCIL on the European Union Space Services Agency and amending Regulation (EU) 2021/696 (Text with EEA relevance)</w:t>
       </w:r>
     </w:p>
-    <w:p/>
     <w:p/>
     <w:sectPr>
       <w:pgSz w:w="11906" w:h="16838"/>

</xml_diff>